<commit_message>
Attach verified Zenodo DOI and final submission metadata
</commit_message>
<xml_diff>
--- a/manuscript/article_revised.docx
+++ b/manuscript/article_revised.docx
@@ -24027,7 +24027,7 @@
       </w:r>
     </w:p>
     <w:bookmarkEnd w:id="53"/>
-    <w:bookmarkStart w:id="55" w:name="data-availability"/>
+    <w:bookmarkStart w:id="56" w:name="data-availability"/>
     <w:p>
       <w:pPr>
         <w:pStyle w:val="Heading2"/>
@@ -24055,11 +24055,25 @@
         </w:r>
       </w:hyperlink>
       <w:r>
-        <w:t xml:space="preserve">. For the independent-record study, all coefficient estimates, covariance summaries and sufficient-statistic fixtures are archived; full time series are regenerated from the frozen seed protocol. The repository includes protocol configurations, source fingerprints, pinned author-code download specifications, compatibility adapters, postprocessing scripts and SHA256 manifests. Pinned download specifications retrieve original author sources. No external experimental dataset is used. The tagged snapshot identifies the version supporting this article; a DOI has not been assigned.</w:t>
+        <w:t xml:space="preserve">. For the independent-record study, all coefficient estimates, covariance summaries and sufficient-statistic fixtures are archived; full time series are regenerated from the frozen seed protocol. The repository includes protocol configurations, source fingerprints, pinned author-code download specifications, compatibility adapters, postprocessing scripts and SHA256 manifests. Pinned download specifications retrieve original author sources. No external experimental dataset is used. The tagged snapshot identifies the version supporting this article; the code and data are preserved in the</w:t>
+      </w:r>
+      <w:r>
+        <w:t xml:space="preserve"> </w:t>
+      </w:r>
+      <w:hyperlink r:id="rId55">
+        <w:r>
+          <w:rPr>
+            <w:rStyle w:val="Hyperlink"/>
+          </w:rPr>
+          <w:t xml:space="preserve">Zenodo archive</w:t>
+        </w:r>
+      </w:hyperlink>
+      <w:r>
+        <w:t xml:space="preserve">.</w:t>
       </w:r>
     </w:p>
-    <w:bookmarkEnd w:id="55"/>
-    <w:bookmarkStart w:id="133" w:name="references"/>
+    <w:bookmarkEnd w:id="56"/>
+    <w:bookmarkStart w:id="134" w:name="references"/>
     <w:p>
       <w:pPr>
         <w:pStyle w:val="Heading2"/>
@@ -24068,8 +24082,8 @@
         <w:t xml:space="preserve">References</w:t>
       </w:r>
     </w:p>
-    <w:bookmarkStart w:id="132" w:name="refs"/>
-    <w:bookmarkStart w:id="57" w:name="ref-brunel2014"/>
+    <w:bookmarkStart w:id="133" w:name="refs"/>
+    <w:bookmarkStart w:id="58" w:name="ref-brunel2014"/>
     <w:p>
       <w:pPr>
         <w:pStyle w:val="Bibliography"/>
@@ -24108,7 +24122,7 @@
       <w:r>
         <w:t xml:space="preserve"> </w:t>
       </w:r>
-      <w:hyperlink r:id="rId56">
+      <w:hyperlink r:id="rId57">
         <w:r>
           <w:rPr>
             <w:rStyle w:val="Hyperlink"/>
@@ -24120,8 +24134,8 @@
         <w:t xml:space="preserve">.</w:t>
       </w:r>
     </w:p>
-    <w:bookmarkEnd w:id="57"/>
-    <w:bookmarkStart w:id="59" w:name="ref-heitzman2026"/>
+    <w:bookmarkEnd w:id="58"/>
+    <w:bookmarkStart w:id="60" w:name="ref-heitzman2026"/>
     <w:p>
       <w:pPr>
         <w:pStyle w:val="Bibliography"/>
@@ -24157,7 +24171,7 @@
       <w:r>
         <w:t xml:space="preserve"> </w:t>
       </w:r>
-      <w:hyperlink r:id="rId58">
+      <w:hyperlink r:id="rId59">
         <w:r>
           <w:rPr>
             <w:rStyle w:val="Hyperlink"/>
@@ -24169,8 +24183,8 @@
         <w:t xml:space="preserve">.</w:t>
       </w:r>
     </w:p>
-    <w:bookmarkEnd w:id="59"/>
-    <w:bookmarkStart w:id="61" w:name="ref-brunton2016"/>
+    <w:bookmarkEnd w:id="60"/>
+    <w:bookmarkStart w:id="62" w:name="ref-brunton2016"/>
     <w:p>
       <w:pPr>
         <w:pStyle w:val="Bibliography"/>
@@ -24206,7 +24220,7 @@
       <w:r>
         <w:t xml:space="preserve"> </w:t>
       </w:r>
-      <w:hyperlink r:id="rId60">
+      <w:hyperlink r:id="rId61">
         <w:r>
           <w:rPr>
             <w:rStyle w:val="Hyperlink"/>
@@ -24218,8 +24232,8 @@
         <w:t xml:space="preserve">.</w:t>
       </w:r>
     </w:p>
-    <w:bookmarkEnd w:id="61"/>
-    <w:bookmarkStart w:id="63" w:name="ref-schaeffer2017"/>
+    <w:bookmarkEnd w:id="62"/>
+    <w:bookmarkStart w:id="64" w:name="ref-schaeffer2017"/>
     <w:p>
       <w:pPr>
         <w:pStyle w:val="Bibliography"/>
@@ -24255,7 +24269,7 @@
       <w:r>
         <w:t xml:space="preserve"> </w:t>
       </w:r>
-      <w:hyperlink r:id="rId62">
+      <w:hyperlink r:id="rId63">
         <w:r>
           <w:rPr>
             <w:rStyle w:val="Hyperlink"/>
@@ -24267,8 +24281,8 @@
         <w:t xml:space="preserve">.</w:t>
       </w:r>
     </w:p>
-    <w:bookmarkEnd w:id="63"/>
-    <w:bookmarkStart w:id="65" w:name="ref-messenger2021"/>
+    <w:bookmarkEnd w:id="64"/>
+    <w:bookmarkStart w:id="66" w:name="ref-messenger2021"/>
     <w:p>
       <w:pPr>
         <w:pStyle w:val="Bibliography"/>
@@ -24313,7 +24327,7 @@
       <w:r>
         <w:t xml:space="preserve"> </w:t>
       </w:r>
-      <w:hyperlink r:id="rId64">
+      <w:hyperlink r:id="rId65">
         <w:r>
           <w:rPr>
             <w:rStyle w:val="Hyperlink"/>
@@ -24325,8 +24339,8 @@
         <w:t xml:space="preserve">.</w:t>
       </w:r>
     </w:p>
-    <w:bookmarkEnd w:id="65"/>
-    <w:bookmarkStart w:id="67" w:name="ref-reinbold2020"/>
+    <w:bookmarkEnd w:id="66"/>
+    <w:bookmarkStart w:id="68" w:name="ref-reinbold2020"/>
     <w:p>
       <w:pPr>
         <w:pStyle w:val="Bibliography"/>
@@ -24362,7 +24376,7 @@
       <w:r>
         <w:t xml:space="preserve"> </w:t>
       </w:r>
-      <w:hyperlink r:id="rId66">
+      <w:hyperlink r:id="rId67">
         <w:r>
           <w:rPr>
             <w:rStyle w:val="Hyperlink"/>
@@ -24374,8 +24388,8 @@
         <w:t xml:space="preserve">.</w:t>
       </w:r>
     </w:p>
-    <w:bookmarkEnd w:id="67"/>
-    <w:bookmarkStart w:id="69" w:name="ref-stein1999"/>
+    <w:bookmarkEnd w:id="68"/>
+    <w:bookmarkStart w:id="70" w:name="ref-stein1999"/>
     <w:p>
       <w:pPr>
         <w:pStyle w:val="Bibliography"/>
@@ -24395,7 +24409,7 @@
       <w:r>
         <w:t xml:space="preserve"> </w:t>
       </w:r>
-      <w:hyperlink r:id="rId68">
+      <w:hyperlink r:id="rId69">
         <w:r>
           <w:rPr>
             <w:rStyle w:val="Hyperlink"/>
@@ -24407,8 +24421,8 @@
         <w:t xml:space="preserve">.</w:t>
       </w:r>
     </w:p>
-    <w:bookmarkEnd w:id="69"/>
-    <w:bookmarkStart w:id="71" w:name="ref-ying1991"/>
+    <w:bookmarkEnd w:id="70"/>
+    <w:bookmarkStart w:id="72" w:name="ref-ying1991"/>
     <w:p>
       <w:pPr>
         <w:pStyle w:val="Bibliography"/>
@@ -24444,7 +24458,7 @@
       <w:r>
         <w:t xml:space="preserve"> </w:t>
       </w:r>
-      <w:hyperlink r:id="rId70">
+      <w:hyperlink r:id="rId71">
         <w:r>
           <w:rPr>
             <w:rStyle w:val="Hyperlink"/>
@@ -24456,8 +24470,8 @@
         <w:t xml:space="preserve">.</w:t>
       </w:r>
     </w:p>
-    <w:bookmarkEnd w:id="71"/>
-    <w:bookmarkStart w:id="73" w:name="ref-zhang2004"/>
+    <w:bookmarkEnd w:id="72"/>
+    <w:bookmarkStart w:id="74" w:name="ref-zhang2004"/>
     <w:p>
       <w:pPr>
         <w:pStyle w:val="Bibliography"/>
@@ -24493,7 +24507,7 @@
       <w:r>
         <w:t xml:space="preserve"> </w:t>
       </w:r>
-      <w:hyperlink r:id="rId72">
+      <w:hyperlink r:id="rId73">
         <w:r>
           <w:rPr>
             <w:rStyle w:val="Hyperlink"/>
@@ -24505,8 +24519,8 @@
         <w:t xml:space="preserve">.</w:t>
       </w:r>
     </w:p>
-    <w:bookmarkEnd w:id="73"/>
-    <w:bookmarkStart w:id="75" w:name="ref-dette2016"/>
+    <w:bookmarkEnd w:id="74"/>
+    <w:bookmarkStart w:id="76" w:name="ref-dette2016"/>
     <w:p>
       <w:pPr>
         <w:pStyle w:val="Bibliography"/>
@@ -24542,7 +24556,7 @@
       <w:r>
         <w:t xml:space="preserve"> </w:t>
       </w:r>
-      <w:hyperlink r:id="rId74">
+      <w:hyperlink r:id="rId75">
         <w:r>
           <w:rPr>
             <w:rStyle w:val="Hyperlink"/>
@@ -24554,8 +24568,8 @@
         <w:t xml:space="preserve">.</w:t>
       </w:r>
     </w:p>
-    <w:bookmarkEnd w:id="75"/>
-    <w:bookmarkStart w:id="77" w:name="ref-messenger2025"/>
+    <w:bookmarkEnd w:id="76"/>
+    <w:bookmarkStart w:id="78" w:name="ref-messenger2025"/>
     <w:p>
       <w:pPr>
         <w:pStyle w:val="Bibliography"/>
@@ -24603,7 +24617,7 @@
       <w:r>
         <w:t xml:space="preserve"> </w:t>
       </w:r>
-      <w:hyperlink r:id="rId76">
+      <w:hyperlink r:id="rId77">
         <w:r>
           <w:rPr>
             <w:rStyle w:val="Hyperlink"/>
@@ -24615,8 +24629,8 @@
         <w:t xml:space="preserve">.</w:t>
       </w:r>
     </w:p>
-    <w:bookmarkEnd w:id="77"/>
-    <w:bookmarkStart w:id="79" w:name="ref-hansen1982"/>
+    <w:bookmarkEnd w:id="78"/>
+    <w:bookmarkStart w:id="80" w:name="ref-hansen1982"/>
     <w:p>
       <w:pPr>
         <w:pStyle w:val="Bibliography"/>
@@ -24652,7 +24666,7 @@
       <w:r>
         <w:t xml:space="preserve"> </w:t>
       </w:r>
-      <w:hyperlink r:id="rId78">
+      <w:hyperlink r:id="rId79">
         <w:r>
           <w:rPr>
             <w:rStyle w:val="Hyperlink"/>
@@ -24664,8 +24678,8 @@
         <w:t xml:space="preserve">.</w:t>
       </w:r>
     </w:p>
-    <w:bookmarkEnd w:id="79"/>
-    <w:bookmarkStart w:id="81" w:name="ref-newey1994"/>
+    <w:bookmarkEnd w:id="80"/>
+    <w:bookmarkStart w:id="82" w:name="ref-newey1994"/>
     <w:p>
       <w:pPr>
         <w:pStyle w:val="Bibliography"/>
@@ -24701,7 +24715,7 @@
       <w:r>
         <w:t xml:space="preserve"> </w:t>
       </w:r>
-      <w:hyperlink r:id="rId80">
+      <w:hyperlink r:id="rId81">
         <w:r>
           <w:rPr>
             <w:rStyle w:val="Hyperlink"/>
@@ -24713,8 +24727,8 @@
         <w:t xml:space="preserve">.</w:t>
       </w:r>
     </w:p>
-    <w:bookmarkEnd w:id="81"/>
-    <w:bookmarkStart w:id="83" w:name="ref-leiner2025"/>
+    <w:bookmarkEnd w:id="82"/>
+    <w:bookmarkStart w:id="84" w:name="ref-leiner2025"/>
     <w:p>
       <w:pPr>
         <w:pStyle w:val="Bibliography"/>
@@ -24750,7 +24764,7 @@
       <w:r>
         <w:t xml:space="preserve"> </w:t>
       </w:r>
-      <w:hyperlink r:id="rId82">
+      <w:hyperlink r:id="rId83">
         <w:r>
           <w:rPr>
             <w:rStyle w:val="Hyperlink"/>
@@ -24762,8 +24776,8 @@
         <w:t xml:space="preserve">.</w:t>
       </w:r>
     </w:p>
-    <w:bookmarkEnd w:id="83"/>
-    <w:bookmarkStart w:id="85" w:name="ref-varah1982"/>
+    <w:bookmarkEnd w:id="84"/>
+    <w:bookmarkStart w:id="86" w:name="ref-varah1982"/>
     <w:p>
       <w:pPr>
         <w:pStyle w:val="Bibliography"/>
@@ -24799,7 +24813,7 @@
       <w:r>
         <w:t xml:space="preserve"> </w:t>
       </w:r>
-      <w:hyperlink r:id="rId84">
+      <w:hyperlink r:id="rId85">
         <w:r>
           <w:rPr>
             <w:rStyle w:val="Hyperlink"/>
@@ -24811,8 +24825,8 @@
         <w:t xml:space="preserve">.</w:t>
       </w:r>
     </w:p>
-    <w:bookmarkEnd w:id="85"/>
-    <w:bookmarkStart w:id="87" w:name="ref-brunel2008"/>
+    <w:bookmarkEnd w:id="86"/>
+    <w:bookmarkStart w:id="88" w:name="ref-brunel2008"/>
     <w:p>
       <w:pPr>
         <w:pStyle w:val="Bibliography"/>
@@ -24857,7 +24871,7 @@
       <w:r>
         <w:t xml:space="preserve"> </w:t>
       </w:r>
-      <w:hyperlink r:id="rId86">
+      <w:hyperlink r:id="rId87">
         <w:r>
           <w:rPr>
             <w:rStyle w:val="Hyperlink"/>
@@ -24869,8 +24883,8 @@
         <w:t xml:space="preserve">.</w:t>
       </w:r>
     </w:p>
-    <w:bookmarkEnd w:id="87"/>
-    <w:bookmarkStart w:id="89" w:name="ref-liang2008"/>
+    <w:bookmarkEnd w:id="88"/>
+    <w:bookmarkStart w:id="90" w:name="ref-liang2008"/>
     <w:p>
       <w:pPr>
         <w:pStyle w:val="Bibliography"/>
@@ -24906,7 +24920,7 @@
       <w:r>
         <w:t xml:space="preserve"> </w:t>
       </w:r>
-      <w:hyperlink r:id="rId88">
+      <w:hyperlink r:id="rId89">
         <w:r>
           <w:rPr>
             <w:rStyle w:val="Hyperlink"/>
@@ -24918,8 +24932,8 @@
         <w:t xml:space="preserve">.</w:t>
       </w:r>
     </w:p>
-    <w:bookmarkEnd w:id="89"/>
-    <w:bookmarkStart w:id="91" w:name="ref-gugushvili2012"/>
+    <w:bookmarkEnd w:id="90"/>
+    <w:bookmarkStart w:id="92" w:name="ref-gugushvili2012"/>
     <w:p>
       <w:pPr>
         <w:pStyle w:val="Bibliography"/>
@@ -24974,7 +24988,7 @@
       <w:r>
         <w:t xml:space="preserve"> </w:t>
       </w:r>
-      <w:hyperlink r:id="rId90">
+      <w:hyperlink r:id="rId91">
         <w:r>
           <w:rPr>
             <w:rStyle w:val="Hyperlink"/>
@@ -24986,8 +25000,8 @@
         <w:t xml:space="preserve">.</w:t>
       </w:r>
     </w:p>
-    <w:bookmarkEnd w:id="91"/>
-    <w:bookmarkStart w:id="93" w:name="ref-dattner2015"/>
+    <w:bookmarkEnd w:id="92"/>
+    <w:bookmarkStart w:id="94" w:name="ref-dattner2015"/>
     <w:p>
       <w:pPr>
         <w:pStyle w:val="Bibliography"/>
@@ -25023,7 +25037,7 @@
       <w:r>
         <w:t xml:space="preserve"> </w:t>
       </w:r>
-      <w:hyperlink r:id="rId92">
+      <w:hyperlink r:id="rId93">
         <w:r>
           <w:rPr>
             <w:rStyle w:val="Hyperlink"/>
@@ -25035,8 +25049,8 @@
         <w:t xml:space="preserve">.</w:t>
       </w:r>
     </w:p>
-    <w:bookmarkEnd w:id="93"/>
-    <w:bookmarkStart w:id="95" w:name="ref-ramsay2007"/>
+    <w:bookmarkEnd w:id="94"/>
+    <w:bookmarkStart w:id="96" w:name="ref-ramsay2007"/>
     <w:p>
       <w:pPr>
         <w:pStyle w:val="Bibliography"/>
@@ -25072,7 +25086,7 @@
       <w:r>
         <w:t xml:space="preserve"> </w:t>
       </w:r>
-      <w:hyperlink r:id="rId94">
+      <w:hyperlink r:id="rId95">
         <w:r>
           <w:rPr>
             <w:rStyle w:val="Hyperlink"/>
@@ -25084,8 +25098,8 @@
         <w:t xml:space="preserve">.</w:t>
       </w:r>
     </w:p>
-    <w:bookmarkEnd w:id="95"/>
-    <w:bookmarkStart w:id="97" w:name="ref-qi2010"/>
+    <w:bookmarkEnd w:id="96"/>
+    <w:bookmarkStart w:id="98" w:name="ref-qi2010"/>
     <w:p>
       <w:pPr>
         <w:pStyle w:val="Bibliography"/>
@@ -25121,7 +25135,7 @@
       <w:r>
         <w:t xml:space="preserve"> </w:t>
       </w:r>
-      <w:hyperlink r:id="rId96">
+      <w:hyperlink r:id="rId97">
         <w:r>
           <w:rPr>
             <w:rStyle w:val="Hyperlink"/>
@@ -25133,8 +25147,8 @@
         <w:t xml:space="preserve">.</w:t>
       </w:r>
     </w:p>
-    <w:bookmarkEnd w:id="97"/>
-    <w:bookmarkStart w:id="99" w:name="ref-dattner2018"/>
+    <w:bookmarkEnd w:id="98"/>
+    <w:bookmarkStart w:id="100" w:name="ref-dattner2018"/>
     <w:p>
       <w:pPr>
         <w:pStyle w:val="Bibliography"/>
@@ -25182,7 +25196,7 @@
       <w:r>
         <w:t xml:space="preserve"> </w:t>
       </w:r>
-      <w:hyperlink r:id="rId98">
+      <w:hyperlink r:id="rId99">
         <w:r>
           <w:rPr>
             <w:rStyle w:val="Hyperlink"/>
@@ -25194,8 +25208,8 @@
         <w:t xml:space="preserve">.</w:t>
       </w:r>
     </w:p>
-    <w:bookmarkEnd w:id="99"/>
-    <w:bookmarkStart w:id="101" w:name="ref-parzen1961"/>
+    <w:bookmarkEnd w:id="100"/>
+    <w:bookmarkStart w:id="102" w:name="ref-parzen1961"/>
     <w:p>
       <w:pPr>
         <w:pStyle w:val="Bibliography"/>
@@ -25231,7 +25245,7 @@
       <w:r>
         <w:t xml:space="preserve"> </w:t>
       </w:r>
-      <w:hyperlink r:id="rId100">
+      <w:hyperlink r:id="rId101">
         <w:r>
           <w:rPr>
             <w:rStyle w:val="Hyperlink"/>
@@ -25243,8 +25257,8 @@
         <w:t xml:space="preserve">.</w:t>
       </w:r>
     </w:p>
-    <w:bookmarkEnd w:id="101"/>
-    <w:bookmarkStart w:id="103" w:name="ref-ibragimov1981"/>
+    <w:bookmarkEnd w:id="102"/>
+    <w:bookmarkStart w:id="104" w:name="ref-ibragimov1981"/>
     <w:p>
       <w:pPr>
         <w:pStyle w:val="Bibliography"/>
@@ -25264,7 +25278,7 @@
       <w:r>
         <w:t xml:space="preserve"> </w:t>
       </w:r>
-      <w:hyperlink r:id="rId102">
+      <w:hyperlink r:id="rId103">
         <w:r>
           <w:rPr>
             <w:rStyle w:val="Hyperlink"/>
@@ -25276,8 +25290,8 @@
         <w:t xml:space="preserve">.</w:t>
       </w:r>
     </w:p>
-    <w:bookmarkEnd w:id="103"/>
-    <w:bookmarkStart w:id="105" w:name="ref-kutoyants1994"/>
+    <w:bookmarkEnd w:id="104"/>
+    <w:bookmarkStart w:id="106" w:name="ref-kutoyants1994"/>
     <w:p>
       <w:pPr>
         <w:pStyle w:val="Bibliography"/>
@@ -25297,7 +25311,7 @@
       <w:r>
         <w:t xml:space="preserve"> </w:t>
       </w:r>
-      <w:hyperlink r:id="rId104">
+      <w:hyperlink r:id="rId105">
         <w:r>
           <w:rPr>
             <w:rStyle w:val="Hyperlink"/>
@@ -25309,8 +25323,8 @@
         <w:t xml:space="preserve">.</w:t>
       </w:r>
     </w:p>
-    <w:bookmarkEnd w:id="105"/>
-    <w:bookmarkStart w:id="107" w:name="ref-bortz2023"/>
+    <w:bookmarkEnd w:id="106"/>
+    <w:bookmarkStart w:id="108" w:name="ref-bortz2023"/>
     <w:p>
       <w:pPr>
         <w:pStyle w:val="Bibliography"/>
@@ -25367,7 +25381,7 @@
       <w:r>
         <w:t xml:space="preserve"> </w:t>
       </w:r>
-      <w:hyperlink r:id="rId106">
+      <w:hyperlink r:id="rId107">
         <w:r>
           <w:rPr>
             <w:rStyle w:val="Hyperlink"/>
@@ -25379,8 +25393,8 @@
         <w:t xml:space="preserve">.</w:t>
       </w:r>
     </w:p>
-    <w:bookmarkEnd w:id="107"/>
-    <w:bookmarkStart w:id="109" w:name="ref-rummel2025"/>
+    <w:bookmarkEnd w:id="108"/>
+    <w:bookmarkStart w:id="110" w:name="ref-rummel2025"/>
     <w:p>
       <w:pPr>
         <w:pStyle w:val="Bibliography"/>
@@ -25400,7 +25414,7 @@
       <w:r>
         <w:t xml:space="preserve"> </w:t>
       </w:r>
-      <w:hyperlink r:id="rId108">
+      <w:hyperlink r:id="rId109">
         <w:r>
           <w:rPr>
             <w:rStyle w:val="Hyperlink"/>
@@ -25436,8 +25450,8 @@
         <w:t xml:space="preserve">. arXiv preprint arXiv:2502.08881v3 (2025).</w:t>
       </w:r>
     </w:p>
-    <w:bookmarkEnd w:id="109"/>
-    <w:bookmarkStart w:id="111" w:name="ref-tran2026"/>
+    <w:bookmarkEnd w:id="110"/>
+    <w:bookmarkStart w:id="112" w:name="ref-tran2026"/>
     <w:p>
       <w:pPr>
         <w:pStyle w:val="Bibliography"/>
@@ -25473,7 +25487,7 @@
       <w:r>
         <w:t xml:space="preserve"> </w:t>
       </w:r>
-      <w:hyperlink r:id="rId110">
+      <w:hyperlink r:id="rId111">
         <w:r>
           <w:rPr>
             <w:rStyle w:val="Hyperlink"/>
@@ -25485,8 +25499,8 @@
         <w:t xml:space="preserve">.</w:t>
       </w:r>
     </w:p>
-    <w:bookmarkEnd w:id="111"/>
-    <w:bookmarkStart w:id="113" w:name="ref-chen2026"/>
+    <w:bookmarkEnd w:id="112"/>
+    <w:bookmarkStart w:id="114" w:name="ref-chen2026"/>
     <w:p>
       <w:pPr>
         <w:pStyle w:val="Bibliography"/>
@@ -25506,7 +25520,7 @@
       <w:r>
         <w:t xml:space="preserve"> </w:t>
       </w:r>
-      <w:hyperlink r:id="rId112">
+      <w:hyperlink r:id="rId113">
         <w:r>
           <w:rPr>
             <w:rStyle w:val="Hyperlink"/>
@@ -25536,8 +25550,8 @@
         <w:t xml:space="preserve">. arXiv preprint arXiv:2604.20141v1 (2026).</w:t>
       </w:r>
     </w:p>
-    <w:bookmarkEnd w:id="113"/>
-    <w:bookmarkStart w:id="115" w:name="ref-chawla2026"/>
+    <w:bookmarkEnd w:id="114"/>
+    <w:bookmarkStart w:id="116" w:name="ref-chawla2026"/>
     <w:p>
       <w:pPr>
         <w:pStyle w:val="Bibliography"/>
@@ -25585,7 +25599,7 @@
       <w:r>
         <w:t xml:space="preserve"> </w:t>
       </w:r>
-      <w:hyperlink r:id="rId114">
+      <w:hyperlink r:id="rId115">
         <w:r>
           <w:rPr>
             <w:rStyle w:val="Hyperlink"/>
@@ -25597,8 +25611,8 @@
         <w:t xml:space="preserve">.</w:t>
       </w:r>
     </w:p>
-    <w:bookmarkEnd w:id="115"/>
-    <w:bookmarkStart w:id="117" w:name="ref-fuller1987"/>
+    <w:bookmarkEnd w:id="116"/>
+    <w:bookmarkStart w:id="118" w:name="ref-fuller1987"/>
     <w:p>
       <w:pPr>
         <w:pStyle w:val="Bibliography"/>
@@ -25618,7 +25632,7 @@
       <w:r>
         <w:t xml:space="preserve"> </w:t>
       </w:r>
-      <w:hyperlink r:id="rId116">
+      <w:hyperlink r:id="rId117">
         <w:r>
           <w:rPr>
             <w:rStyle w:val="Hyperlink"/>
@@ -25630,8 +25644,8 @@
         <w:t xml:space="preserve">.</w:t>
       </w:r>
     </w:p>
-    <w:bookmarkEnd w:id="117"/>
-    <w:bookmarkStart w:id="119" w:name="ref-stefanski1989"/>
+    <w:bookmarkEnd w:id="118"/>
+    <w:bookmarkStart w:id="120" w:name="ref-stefanski1989"/>
     <w:p>
       <w:pPr>
         <w:pStyle w:val="Bibliography"/>
@@ -25667,7 +25681,7 @@
       <w:r>
         <w:t xml:space="preserve"> </w:t>
       </w:r>
-      <w:hyperlink r:id="rId118">
+      <w:hyperlink r:id="rId119">
         <w:r>
           <w:rPr>
             <w:rStyle w:val="Hyperlink"/>
@@ -25679,8 +25693,8 @@
         <w:t xml:space="preserve">.</w:t>
       </w:r>
     </w:p>
-    <w:bookmarkEnd w:id="119"/>
-    <w:bookmarkStart w:id="121" w:name="ref-lopez2026"/>
+    <w:bookmarkEnd w:id="120"/>
+    <w:bookmarkStart w:id="122" w:name="ref-lopez2026"/>
     <w:p>
       <w:pPr>
         <w:pStyle w:val="Bibliography"/>
@@ -25716,7 +25730,7 @@
       <w:r>
         <w:t xml:space="preserve"> </w:t>
       </w:r>
-      <w:hyperlink r:id="rId120">
+      <w:hyperlink r:id="rId121">
         <w:r>
           <w:rPr>
             <w:rStyle w:val="Hyperlink"/>
@@ -25728,8 +25742,8 @@
         <w:t xml:space="preserve">.</w:t>
       </w:r>
     </w:p>
-    <w:bookmarkEnd w:id="121"/>
-    <w:bookmarkStart w:id="123" w:name="ref-fasel2022"/>
+    <w:bookmarkEnd w:id="122"/>
+    <w:bookmarkStart w:id="124" w:name="ref-fasel2022"/>
     <w:p>
       <w:pPr>
         <w:pStyle w:val="Bibliography"/>
@@ -25771,7 +25785,7 @@
       <w:r>
         <w:t xml:space="preserve"> </w:t>
       </w:r>
-      <w:hyperlink r:id="rId122">
+      <w:hyperlink r:id="rId123">
         <w:r>
           <w:rPr>
             <w:rStyle w:val="Hyperlink"/>
@@ -25783,8 +25797,8 @@
         <w:t xml:space="preserve">.</w:t>
       </w:r>
     </w:p>
-    <w:bookmarkEnd w:id="123"/>
-    <w:bookmarkStart w:id="125" w:name="ref-uhlenbeck1930"/>
+    <w:bookmarkEnd w:id="124"/>
+    <w:bookmarkStart w:id="126" w:name="ref-uhlenbeck1930"/>
     <w:p>
       <w:pPr>
         <w:pStyle w:val="Bibliography"/>
@@ -25820,7 +25834,7 @@
       <w:r>
         <w:t xml:space="preserve"> </w:t>
       </w:r>
-      <w:hyperlink r:id="rId124">
+      <w:hyperlink r:id="rId125">
         <w:r>
           <w:rPr>
             <w:rStyle w:val="Hyperlink"/>
@@ -25832,8 +25846,8 @@
         <w:t xml:space="preserve">.</w:t>
       </w:r>
     </w:p>
-    <w:bookmarkEnd w:id="125"/>
-    <w:bookmarkStart w:id="127" w:name="ref-cameron1944"/>
+    <w:bookmarkEnd w:id="126"/>
+    <w:bookmarkStart w:id="128" w:name="ref-cameron1944"/>
     <w:p>
       <w:pPr>
         <w:pStyle w:val="Bibliography"/>
@@ -25869,7 +25883,7 @@
       <w:r>
         <w:t xml:space="preserve"> </w:t>
       </w:r>
-      <w:hyperlink r:id="rId126">
+      <w:hyperlink r:id="rId127">
         <w:r>
           <w:rPr>
             <w:rStyle w:val="Hyperlink"/>
@@ -25881,8 +25895,8 @@
         <w:t xml:space="preserve">.</w:t>
       </w:r>
     </w:p>
-    <w:bookmarkEnd w:id="127"/>
-    <w:bookmarkStart w:id="129" w:name="ref-feldman1958"/>
+    <w:bookmarkEnd w:id="128"/>
+    <w:bookmarkStart w:id="130" w:name="ref-feldman1958"/>
     <w:p>
       <w:pPr>
         <w:pStyle w:val="Bibliography"/>
@@ -25918,7 +25932,7 @@
       <w:r>
         <w:t xml:space="preserve"> </w:t>
       </w:r>
-      <w:hyperlink r:id="rId128">
+      <w:hyperlink r:id="rId129">
         <w:r>
           <w:rPr>
             <w:rStyle w:val="Hyperlink"/>
@@ -25930,8 +25944,8 @@
         <w:t xml:space="preserve">.</w:t>
       </w:r>
     </w:p>
-    <w:bookmarkEnd w:id="129"/>
-    <w:bookmarkStart w:id="131" w:name="ref-isserlis1918"/>
+    <w:bookmarkEnd w:id="130"/>
+    <w:bookmarkStart w:id="132" w:name="ref-isserlis1918"/>
     <w:p>
       <w:pPr>
         <w:pStyle w:val="Bibliography"/>
@@ -25967,7 +25981,7 @@
       <w:r>
         <w:t xml:space="preserve"> </w:t>
       </w:r>
-      <w:hyperlink r:id="rId130">
+      <w:hyperlink r:id="rId131">
         <w:r>
           <w:rPr>
             <w:rStyle w:val="Hyperlink"/>
@@ -25979,9 +25993,9 @@
         <w:t xml:space="preserve">.</w:t>
       </w:r>
     </w:p>
-    <w:bookmarkEnd w:id="131"/>
     <w:bookmarkEnd w:id="132"/>
     <w:bookmarkEnd w:id="133"/>
+    <w:bookmarkEnd w:id="134"/>
     <w:sectPr>
       <w:footnotePr>
         <w:numRestart w:val="eachSect"/>

</xml_diff>